<commit_message>
docs: guide now says the shared database is at migration 0016
Co-Authored-By: Claude Sonnet 5.5 <noreply@anthropic.com>
</commit_message>
<xml_diff>
--- a/docs/heyyERP-Frontend-Backend-Guide.docx
+++ b/docs/heyyERP-Frontend-Backend-Guide.docx
@@ -1403,23 +1403,7 @@
         <w:pStyle w:val="ListBullet"/>
       </w:pPr>
       <w:r>
-        <w:rPr>
-          <w:b/>
-        </w:rPr>
-        <w:t>Heads-up:</w:t>
-      </w:r>
-      <w:r>
-        <w:t xml:space="preserve"> the shared database was migrated to </w:t>
-      </w:r>
-      <w:r>
-        <w:rPr>
-          <w:rFonts w:ascii="Consolas" w:hAnsi="Consolas"/>
-          <w:color w:val="1F4E79"/>
-        </w:rPr>
-        <w:t>0013</w:t>
-      </w:r>
-      <w:r>
-        <w:t xml:space="preserve"> on 28 Oct. Backend code is at </w:t>
+        <w:t xml:space="preserve">The shared database is at migration </w:t>
       </w:r>
       <w:r>
         <w:rPr>
@@ -1429,7 +1413,7 @@
         <w:t>0016</w:t>
       </w:r>
       <w:r>
-        <w:t>.</w:t>
+        <w:t>, the same as the backend code (updated on 28 Oct 2026),</w:t>
       </w:r>
     </w:p>
     <w:p>
@@ -1437,17 +1421,7 @@
         <w:spacing w:after="80"/>
       </w:pPr>
       <w:r>
-        <w:t xml:space="preserve">  The sales endpoints (section 7.10) fail until the owner migrates it to </w:t>
-      </w:r>
-      <w:r>
-        <w:rPr>
-          <w:rFonts w:ascii="Consolas" w:hAnsi="Consolas"/>
-          <w:color w:val="1F4E79"/>
-        </w:rPr>
-        <w:t>0016</w:t>
-      </w:r>
-      <w:r>
-        <w:t>. Ask before you</w:t>
+        <w:t xml:space="preserve">  so every module in section 8, including sales, works against it. When the backend owner adds a</w:t>
       </w:r>
     </w:p>
     <w:p>
@@ -1455,7 +1429,15 @@
         <w:spacing w:after="80"/>
       </w:pPr>
       <w:r>
-        <w:t xml:space="preserve">  start on sales screens.</w:t>
+        <w:t xml:space="preserve">  migration later, he updates the shared database and tells the team; until then new endpoints that</w:t>
+      </w:r>
+    </w:p>
+    <w:p>
+      <w:pPr>
+        <w:spacing w:after="80"/>
+      </w:pPr>
+      <w:r>
+        <w:t xml:space="preserve">  need new tables will fail.</w:t>
       </w:r>
     </w:p>
     <w:p>
@@ -5550,7 +5532,7 @@
         <w:spacing w:after="80"/>
       </w:pPr>
       <w:r>
-        <w:t xml:space="preserve">inter-unit invoices. Requires the database at migration </w:t>
+        <w:t xml:space="preserve">inter-unit invoices. The shared database already has the sales tables (migration </w:t>
       </w:r>
       <w:r>
         <w:rPr>
@@ -5560,7 +5542,7 @@
         <w:t>0016</w:t>
       </w:r>
       <w:r>
-        <w:t xml:space="preserve"> (see section 4).</w:t>
+        <w:t>).</w:t>
       </w:r>
     </w:p>
     <w:p>

</xml_diff>

<commit_message>
feat(api): encrypted vendor bank accounts and a per-rule option to keep a second approver
Bank account numbers are stored AES-256-GCM encrypted (key DATA_ENCRYPTION_KEY, bound to the vendor
row) and only the bank file decrypts them. Approval rules gain skip_requester_role; the default
R-BILL rule turns it off so a bill exception needs another Accounts user. Migration 0019.

Co-Authored-By: Claude Sonnet 5.5 <noreply@anthropic.com>
</commit_message>
<xml_diff>
--- a/docs/heyyERP-Frontend-Backend-Guide.docx
+++ b/docs/heyyERP-Frontend-Backend-Guide.docx
@@ -919,6 +919,20 @@
               <w:rPr>
                 <w:sz w:val="17"/>
               </w:rPr>
+              <w:t xml:space="preserve">, </w:t>
+            </w:r>
+            <w:r>
+              <w:rPr>
+                <w:rFonts w:ascii="Consolas" w:hAnsi="Consolas"/>
+                <w:color w:val="1F4E79"/>
+                <w:sz w:val="17"/>
+              </w:rPr>
+              <w:t>DATA_ENCRYPTION_KEY</w:t>
+            </w:r>
+            <w:r>
+              <w:rPr>
+                <w:sz w:val="17"/>
+              </w:rPr>
               <w:t xml:space="preserve">, optional </w:t>
             </w:r>
             <w:r>
@@ -1338,6 +1352,30 @@
       </w:r>
       <w:r>
         <w:t>.</w:t>
+      </w:r>
+    </w:p>
+    <w:p>
+      <w:pPr>
+        <w:pStyle w:val="ListBullet"/>
+      </w:pPr>
+      <w:r>
+        <w:rPr>
+          <w:rFonts w:ascii="Consolas" w:hAnsi="Consolas"/>
+          <w:color w:val="1F4E79"/>
+        </w:rPr>
+        <w:t>DATA_ENCRYPTION_KEY</w:t>
+      </w:r>
+      <w:r>
+        <w:t xml:space="preserve"> encrypts vendor bank account numbers (AES-256). It must be </w:t>
+      </w:r>
+      <w:r>
+        <w:rPr>
+          <w:b/>
+        </w:rPr>
+        <w:t>the same value for everyone</w:t>
+      </w:r>
+      <w:r>
+        <w:t xml:space="preserve"> who shares the database. Without it the bank-account endpoints answer 503; nothing else is affected.</w:t>
       </w:r>
     </w:p>
     <w:p>
@@ -4437,6 +4475,60 @@
       </w:r>
       <w:r>
         <w:t>.</w:t>
+      </w:r>
+    </w:p>
+    <w:p>
+      <w:pPr>
+        <w:pStyle w:val="ListBullet"/>
+      </w:pPr>
+      <w:r>
+        <w:t>Each rule (</w:t>
+      </w:r>
+      <w:r>
+        <w:rPr>
+          <w:rFonts w:ascii="Consolas" w:hAnsi="Consolas"/>
+          <w:color w:val="1F4E79"/>
+        </w:rPr>
+        <w:t>/admin/approval-rules</w:t>
+      </w:r>
+      <w:r>
+        <w:t xml:space="preserve">) has the option </w:t>
+      </w:r>
+      <w:r>
+        <w:rPr>
+          <w:rFonts w:ascii="Consolas" w:hAnsi="Consolas"/>
+          <w:color w:val="1F4E79"/>
+        </w:rPr>
+        <w:t>skip_requester_role</w:t>
+      </w:r>
+      <w:r>
+        <w:t>. True (the default) skips a step</w:t>
+      </w:r>
+    </w:p>
+    <w:p>
+      <w:pPr>
+        <w:spacing w:after="80"/>
+      </w:pPr>
+      <w:r>
+        <w:t xml:space="preserve">  held by the requester's own role; false makes another person of that role approve it. Supplier-bill</w:t>
+      </w:r>
+    </w:p>
+    <w:p>
+      <w:pPr>
+        <w:spacing w:after="80"/>
+      </w:pPr>
+      <w:r>
+        <w:t xml:space="preserve">  exceptions (</w:t>
+      </w:r>
+      <w:r>
+        <w:rPr>
+          <w:rFonts w:ascii="Consolas" w:hAnsi="Consolas"/>
+          <w:color w:val="1F4E79"/>
+        </w:rPr>
+        <w:t>R-BILL</w:t>
+      </w:r>
+      <w:r>
+        <w:t>) use false, so a second Accounts user must approve them.</w:t>
       </w:r>
     </w:p>
     <w:p>

</xml_diff>

<commit_message>
docs: env variable for bank encryption and the approval rule option
Co-Authored-By: Claude Sonnet 5.5 <noreply@anthropic.com>
</commit_message>
<xml_diff>
--- a/docs/heyyERP-Frontend-Backend-Guide.docx
+++ b/docs/heyyERP-Frontend-Backend-Guide.docx
@@ -919,6 +919,20 @@
               <w:rPr>
                 <w:sz w:val="17"/>
               </w:rPr>
+              <w:t xml:space="preserve">, </w:t>
+            </w:r>
+            <w:r>
+              <w:rPr>
+                <w:rFonts w:ascii="Consolas" w:hAnsi="Consolas"/>
+                <w:color w:val="1F4E79"/>
+                <w:sz w:val="17"/>
+              </w:rPr>
+              <w:t>DATA_ENCRYPTION_KEY</w:t>
+            </w:r>
+            <w:r>
+              <w:rPr>
+                <w:sz w:val="17"/>
+              </w:rPr>
               <w:t xml:space="preserve">, optional </w:t>
             </w:r>
             <w:r>
@@ -1338,6 +1352,30 @@
       </w:r>
       <w:r>
         <w:t>.</w:t>
+      </w:r>
+    </w:p>
+    <w:p>
+      <w:pPr>
+        <w:pStyle w:val="ListBullet"/>
+      </w:pPr>
+      <w:r>
+        <w:rPr>
+          <w:rFonts w:ascii="Consolas" w:hAnsi="Consolas"/>
+          <w:color w:val="1F4E79"/>
+        </w:rPr>
+        <w:t>DATA_ENCRYPTION_KEY</w:t>
+      </w:r>
+      <w:r>
+        <w:t xml:space="preserve"> encrypts vendor bank account numbers (AES-256). It must be </w:t>
+      </w:r>
+      <w:r>
+        <w:rPr>
+          <w:b/>
+        </w:rPr>
+        <w:t>the same value for everyone</w:t>
+      </w:r>
+      <w:r>
+        <w:t xml:space="preserve"> who shares the database. Without it the bank-account endpoints answer 503; nothing else is affected.</w:t>
       </w:r>
     </w:p>
     <w:p>
@@ -4437,6 +4475,60 @@
       </w:r>
       <w:r>
         <w:t>.</w:t>
+      </w:r>
+    </w:p>
+    <w:p>
+      <w:pPr>
+        <w:pStyle w:val="ListBullet"/>
+      </w:pPr>
+      <w:r>
+        <w:t>Each rule (</w:t>
+      </w:r>
+      <w:r>
+        <w:rPr>
+          <w:rFonts w:ascii="Consolas" w:hAnsi="Consolas"/>
+          <w:color w:val="1F4E79"/>
+        </w:rPr>
+        <w:t>/admin/approval-rules</w:t>
+      </w:r>
+      <w:r>
+        <w:t xml:space="preserve">) has the option </w:t>
+      </w:r>
+      <w:r>
+        <w:rPr>
+          <w:rFonts w:ascii="Consolas" w:hAnsi="Consolas"/>
+          <w:color w:val="1F4E79"/>
+        </w:rPr>
+        <w:t>skip_requester_role</w:t>
+      </w:r>
+      <w:r>
+        <w:t>. True (the default) skips a step</w:t>
+      </w:r>
+    </w:p>
+    <w:p>
+      <w:pPr>
+        <w:spacing w:after="80"/>
+      </w:pPr>
+      <w:r>
+        <w:t xml:space="preserve">  held by the requester's own role; false makes another person of that role approve it. Supplier-bill</w:t>
+      </w:r>
+    </w:p>
+    <w:p>
+      <w:pPr>
+        <w:spacing w:after="80"/>
+      </w:pPr>
+      <w:r>
+        <w:t xml:space="preserve">  exceptions (</w:t>
+      </w:r>
+      <w:r>
+        <w:rPr>
+          <w:rFonts w:ascii="Consolas" w:hAnsi="Consolas"/>
+          <w:color w:val="1F4E79"/>
+        </w:rPr>
+        <w:t>R-BILL</w:t>
+      </w:r>
+      <w:r>
+        <w:t>) use false, so a second Accounts user must approve them.</w:t>
       </w:r>
     </w:p>
     <w:p>

</xml_diff>